<commit_message>
Polish notebook and add VADER binary distribution
</commit_message>
<xml_diff>
--- a/report/TT8L_Haque Radiah_Group10_ASGN.docx
+++ b/report/TT8L_Haque Radiah_Group10_ASGN.docx
@@ -12,7 +12,7 @@
           <w:noProof/>
         </w:rPr>
         <w:drawing>
-          <wp:inline distT="0" distB="0" distL="0" distR="0" wp14:anchorId="70556ED4" wp14:editId="2B0F45A7">
+          <wp:inline distT="0" distB="0" distL="0" distR="0" wp14:anchorId="70556ED4" wp14:editId="00DC29EB">
             <wp:extent cx="5731510" cy="1781175"/>
             <wp:effectExtent l="0" t="0" r="0" b="0"/>
             <wp:docPr id="541726581" name="Picture 1">
@@ -8226,7 +8226,7 @@
           <w:noProof/>
         </w:rPr>
         <w:drawing>
-          <wp:inline distT="0" distB="0" distL="0" distR="0" wp14:anchorId="2682712A" wp14:editId="008936FD">
+          <wp:inline distT="0" distB="0" distL="0" distR="0" wp14:anchorId="2682712A" wp14:editId="0AA1EBB5">
             <wp:extent cx="5274310" cy="3722370"/>
             <wp:effectExtent l="0" t="0" r="2540" b="0"/>
             <wp:docPr id="1096915330" name="Picture 1"/>
@@ -8403,200 +8403,19 @@
     </w:p>
     <w:p>
       <w:pPr>
-        <w:spacing w:before="100" w:beforeAutospacing="1" w:after="100" w:afterAutospacing="1" w:line="360" w:lineRule="auto"/>
-        <w:jc w:val="both"/>
-        <w:rPr>
-          <w:rFonts w:eastAsia="Times New Roman"/>
-          <w:kern w:val="0"/>
-          <w:lang w:val="en-US" w:eastAsia="en-US"/>
-          <w14:ligatures w14:val="none"/>
-        </w:rPr>
-      </w:pPr>
-      <w:r>
-        <w:rPr>
-          <w:rFonts w:eastAsia="Times New Roman"/>
-          <w:kern w:val="0"/>
-          <w:lang w:val="en-US" w:eastAsia="en-US"/>
-          <w14:ligatures w14:val="none"/>
-        </w:rPr>
-        <w:t xml:space="preserve">After binary conversion, the VADER label is compared with the Steam </w:t>
-      </w:r>
-      <w:proofErr w:type="spellStart"/>
-      <w:r>
-        <w:rPr>
-          <w:rFonts w:eastAsia="Times New Roman"/>
-          <w:kern w:val="0"/>
-          <w:lang w:val="en-US" w:eastAsia="en-US"/>
-          <w14:ligatures w14:val="none"/>
-        </w:rPr>
-        <w:t>voted_up</w:t>
-      </w:r>
-      <w:proofErr w:type="spellEnd"/>
-      <w:r>
-        <w:rPr>
-          <w:rFonts w:eastAsia="Times New Roman"/>
-          <w:kern w:val="0"/>
-          <w:lang w:val="en-US" w:eastAsia="en-US"/>
-          <w14:ligatures w14:val="none"/>
-        </w:rPr>
-        <w:t xml:space="preserve"> label. The comparison shows an agreement rate of 69.36%. This means that in most cases, the written emotional tone of the review agrees with the Steam recommendation. However, around one-third of cases do not match. These mismatches are expected because Steam recommendation </w:t>
-      </w:r>
-      <w:proofErr w:type="spellStart"/>
-      <w:r>
-        <w:rPr>
-          <w:rFonts w:eastAsia="Times New Roman"/>
-          <w:kern w:val="0"/>
-          <w:lang w:val="en-US" w:eastAsia="en-US"/>
-          <w14:ligatures w14:val="none"/>
-        </w:rPr>
-        <w:t>behaviour</w:t>
-      </w:r>
-      <w:proofErr w:type="spellEnd"/>
-      <w:r>
-        <w:rPr>
-          <w:rFonts w:eastAsia="Times New Roman"/>
-          <w:kern w:val="0"/>
-          <w:lang w:val="en-US" w:eastAsia="en-US"/>
-          <w14:ligatures w14:val="none"/>
-        </w:rPr>
-        <w:t xml:space="preserve"> is not always the same as written sentiment.</w:t>
-      </w:r>
-    </w:p>
-    <w:p>
-      <w:pPr>
-        <w:spacing w:before="100" w:beforeAutospacing="1" w:after="100" w:afterAutospacing="1" w:line="360" w:lineRule="auto"/>
-        <w:jc w:val="both"/>
-        <w:rPr>
-          <w:rFonts w:eastAsia="Times New Roman"/>
-          <w:kern w:val="0"/>
-          <w:lang w:val="en-US" w:eastAsia="en-US"/>
-          <w14:ligatures w14:val="none"/>
-        </w:rPr>
-      </w:pPr>
-      <w:r>
-        <w:rPr>
-          <w:rFonts w:eastAsia="Times New Roman"/>
-          <w:kern w:val="0"/>
-          <w:lang w:val="en-US" w:eastAsia="en-US"/>
-          <w14:ligatures w14:val="none"/>
-        </w:rPr>
-        <w:t>Some players may use positive language while still not recommending the game because of price, bugs, online issues, or anti-cheat problems. Other players may write short, sarcastic, neutral, or mixed reviews that a lexicon-based method cannot interpret perfectly. Therefore, the VADER comparison supports Hypothesis 4 only partially: written sentiment and Steam recommendation are related, but they are not identical.</w:t>
-      </w:r>
-    </w:p>
-    <w:p>
-      <w:pPr>
-        <w:spacing w:before="100" w:beforeAutospacing="1" w:after="100" w:afterAutospacing="1" w:line="360" w:lineRule="auto"/>
-        <w:jc w:val="both"/>
-        <w:rPr>
-          <w:rFonts w:eastAsia="Times New Roman"/>
-          <w:kern w:val="0"/>
-          <w:lang w:val="en-US" w:eastAsia="en-US"/>
-          <w14:ligatures w14:val="none"/>
-        </w:rPr>
-      </w:pPr>
-      <w:r>
-        <w:rPr>
-          <w:rFonts w:eastAsia="Times New Roman"/>
-          <w:kern w:val="0"/>
-          <w:lang w:val="en-US" w:eastAsia="en-US"/>
-          <w14:ligatures w14:val="none"/>
-        </w:rPr>
-        <w:t>The VADER 3-class distribution is also used to create the target labels for the additional multi-class sentiment classification experiment. The distribution contains 6,659 Negative reviews, 6,224 Neutral reviews</w:t>
-      </w:r>
-      <w:r>
-        <w:rPr>
-          <w:rFonts w:eastAsia="Times New Roman"/>
-          <w:kern w:val="0"/>
-          <w:lang w:val="en-US" w:eastAsia="en-US"/>
-          <w14:ligatures w14:val="none"/>
-        </w:rPr>
-        <w:t xml:space="preserve"> </w:t>
-      </w:r>
-      <w:r>
-        <w:rPr>
-          <w:rFonts w:eastAsia="Times New Roman"/>
-          <w:kern w:val="0"/>
-          <w:lang w:val="en-US" w:eastAsia="en-US"/>
-          <w14:ligatures w14:val="none"/>
-        </w:rPr>
-        <w:t>and 7,167 Positive reviews. These values represent 33.21%</w:t>
-      </w:r>
-      <w:r>
-        <w:rPr>
-          <w:rFonts w:eastAsia="Times New Roman"/>
-          <w:kern w:val="0"/>
-          <w:lang w:val="en-US" w:eastAsia="en-US"/>
-          <w14:ligatures w14:val="none"/>
-        </w:rPr>
-        <w:t>,</w:t>
-      </w:r>
-      <w:r>
-        <w:rPr>
-          <w:rFonts w:eastAsia="Times New Roman"/>
-          <w:kern w:val="0"/>
-          <w:lang w:val="en-US" w:eastAsia="en-US"/>
-          <w14:ligatures w14:val="none"/>
-        </w:rPr>
-        <w:t xml:space="preserve"> 31.04% and 35.75% of the cleaned dataset respectively. This shows that the VADER-derived written sentiment labels are relatively balanced across the three classes.</w:t>
-      </w:r>
-    </w:p>
-    <w:p>
-      <w:pPr>
-        <w:spacing w:before="100" w:beforeAutospacing="1" w:after="100" w:afterAutospacing="1" w:line="360" w:lineRule="auto"/>
-        <w:jc w:val="both"/>
-        <w:rPr>
-          <w:rFonts w:eastAsia="Times New Roman"/>
-          <w:kern w:val="0"/>
-          <w:lang w:val="en-US" w:eastAsia="en-US"/>
-          <w14:ligatures w14:val="none"/>
-        </w:rPr>
-      </w:pPr>
-      <w:r>
-        <w:rPr>
-          <w:rFonts w:eastAsia="Times New Roman"/>
-          <w:kern w:val="0"/>
-          <w:lang w:val="en-US" w:eastAsia="en-US"/>
-          <w14:ligatures w14:val="none"/>
-        </w:rPr>
-        <w:t xml:space="preserve">However, these multi-class labels must be interpreted carefully. They are weak labels generated by a lexicon-based sentiment method, not manually annotated human labels. Therefore, they represent VADER-style written polarity rather than true human-labelled emotion. This is different from the binary </w:t>
-      </w:r>
-      <w:proofErr w:type="spellStart"/>
-      <w:r>
-        <w:rPr>
-          <w:rFonts w:eastAsia="Times New Roman"/>
-          <w:kern w:val="0"/>
-          <w:lang w:val="en-US" w:eastAsia="en-US"/>
-          <w14:ligatures w14:val="none"/>
-        </w:rPr>
-        <w:t>voted_up</w:t>
-      </w:r>
-      <w:proofErr w:type="spellEnd"/>
-      <w:r>
-        <w:rPr>
-          <w:rFonts w:eastAsia="Times New Roman"/>
-          <w:kern w:val="0"/>
-          <w:lang w:val="en-US" w:eastAsia="en-US"/>
-          <w14:ligatures w14:val="none"/>
-        </w:rPr>
-        <w:t xml:space="preserve"> task, where the model predicts the actual Steam recommendation outcome. The binary task remains the main supervised task because it uses the real label provided in the dataset, while the multi-class task is added to compare how different models perform when Neutral sentiment is included.</w:t>
-      </w:r>
-    </w:p>
-    <w:p>
-      <w:pPr>
         <w:keepNext/>
         <w:spacing w:before="100" w:beforeAutospacing="1" w:after="100" w:afterAutospacing="1" w:line="360" w:lineRule="auto"/>
-        <w:jc w:val="both"/>
+        <w:jc w:val="center"/>
       </w:pPr>
       <w:r>
         <w:rPr>
           <w:noProof/>
         </w:rPr>
-        <w:lastRenderedPageBreak/>
         <w:drawing>
-          <wp:inline distT="0" distB="0" distL="0" distR="0" wp14:anchorId="778C45FE" wp14:editId="23409B0E">
+          <wp:inline distT="0" distB="0" distL="0" distR="0" wp14:anchorId="0C939A83" wp14:editId="0DFEFFA4">
             <wp:extent cx="5274310" cy="3722370"/>
             <wp:effectExtent l="0" t="0" r="2540" b="0"/>
-            <wp:docPr id="1233363861" name="Picture 2"/>
+            <wp:docPr id="781789643" name="Picture 1"/>
             <wp:cNvGraphicFramePr>
               <a:graphicFrameLocks xmlns:a="http://schemas.openxmlformats.org/drawingml/2006/main" noChangeAspect="1"/>
             </wp:cNvGraphicFramePr>
@@ -8604,7 +8423,7 @@
               <a:graphicData uri="http://schemas.openxmlformats.org/drawingml/2006/picture">
                 <pic:pic xmlns:pic="http://schemas.openxmlformats.org/drawingml/2006/picture">
                   <pic:nvPicPr>
-                    <pic:cNvPr id="0" name="Picture 6"/>
+                    <pic:cNvPr id="0" name="Picture 1"/>
                     <pic:cNvPicPr>
                       <a:picLocks noChangeAspect="1" noChangeArrowheads="1"/>
                     </pic:cNvPicPr>
@@ -8647,7 +8466,10 @@
         <w:pStyle w:val="Caption"/>
         <w:jc w:val="center"/>
         <w:rPr>
-          <w:lang w:val="en-US"/>
+          <w:rFonts w:eastAsia="Times New Roman"/>
+          <w:kern w:val="0"/>
+          <w:lang w:val="en-US" w:eastAsia="en-US"/>
+          <w14:ligatures w14:val="none"/>
         </w:rPr>
       </w:pPr>
       <w:r>
@@ -8683,7 +8505,323 @@
         <w:rPr>
           <w:lang w:val="en-US"/>
         </w:rPr>
+        <w:t xml:space="preserve">: </w:t>
+      </w:r>
+      <w:r>
+        <w:rPr>
+          <w:lang w:val="en-US"/>
+        </w:rPr>
+        <w:t>Distribution of binary VADER sentiment labels after conversion for comparison with Steam</w:t>
+      </w:r>
+    </w:p>
+    <w:p>
+      <w:pPr>
+        <w:spacing w:before="100" w:beforeAutospacing="1" w:after="100" w:afterAutospacing="1" w:line="360" w:lineRule="auto"/>
+        <w:jc w:val="both"/>
+        <w:rPr>
+          <w:rFonts w:eastAsia="Times New Roman"/>
+          <w:kern w:val="0"/>
+          <w:lang w:val="en-US" w:eastAsia="en-US"/>
+          <w14:ligatures w14:val="none"/>
+        </w:rPr>
+      </w:pPr>
+      <w:r>
+        <w:rPr>
+          <w:rFonts w:eastAsia="Times New Roman"/>
+          <w:kern w:val="0"/>
+          <w:lang w:val="en-US" w:eastAsia="en-US"/>
+          <w14:ligatures w14:val="none"/>
+        </w:rPr>
+        <w:t xml:space="preserve">After binary conversion, the VADER label is compared with the Steam </w:t>
+      </w:r>
+      <w:proofErr w:type="spellStart"/>
+      <w:r>
+        <w:rPr>
+          <w:rFonts w:eastAsia="Times New Roman"/>
+          <w:kern w:val="0"/>
+          <w:lang w:val="en-US" w:eastAsia="en-US"/>
+          <w14:ligatures w14:val="none"/>
+        </w:rPr>
+        <w:t>voted_up</w:t>
+      </w:r>
+      <w:proofErr w:type="spellEnd"/>
+      <w:r>
+        <w:rPr>
+          <w:rFonts w:eastAsia="Times New Roman"/>
+          <w:kern w:val="0"/>
+          <w:lang w:val="en-US" w:eastAsia="en-US"/>
+          <w14:ligatures w14:val="none"/>
+        </w:rPr>
+        <w:t xml:space="preserve"> label. The comparison shows an agreement rate of 69.36%. This means that in most cases, the written emotional tone of the review agrees with the Steam recommendation. However, around one-third of cases do not match. These mismatches are expected because Steam recommendation </w:t>
+      </w:r>
+      <w:proofErr w:type="spellStart"/>
+      <w:r>
+        <w:rPr>
+          <w:rFonts w:eastAsia="Times New Roman"/>
+          <w:kern w:val="0"/>
+          <w:lang w:val="en-US" w:eastAsia="en-US"/>
+          <w14:ligatures w14:val="none"/>
+        </w:rPr>
+        <w:t>behaviour</w:t>
+      </w:r>
+      <w:proofErr w:type="spellEnd"/>
+      <w:r>
+        <w:rPr>
+          <w:rFonts w:eastAsia="Times New Roman"/>
+          <w:kern w:val="0"/>
+          <w:lang w:val="en-US" w:eastAsia="en-US"/>
+          <w14:ligatures w14:val="none"/>
+        </w:rPr>
+        <w:t xml:space="preserve"> is not always the same as written sentiment.</w:t>
+      </w:r>
+    </w:p>
+    <w:p>
+      <w:pPr>
+        <w:spacing w:before="100" w:beforeAutospacing="1" w:after="100" w:afterAutospacing="1" w:line="360" w:lineRule="auto"/>
+        <w:jc w:val="both"/>
+        <w:rPr>
+          <w:rFonts w:eastAsia="Times New Roman"/>
+          <w:kern w:val="0"/>
+          <w:lang w:val="en-US" w:eastAsia="en-US"/>
+          <w14:ligatures w14:val="none"/>
+        </w:rPr>
+      </w:pPr>
+      <w:r>
+        <w:rPr>
+          <w:rFonts w:eastAsia="Times New Roman"/>
+          <w:kern w:val="0"/>
+          <w:lang w:val="en-US" w:eastAsia="en-US"/>
+          <w14:ligatures w14:val="none"/>
+        </w:rPr>
+        <w:t>Some players may use positive language while still not recommending the game because of price, bugs, online issues, or anti-cheat problems. Other players may write short, sarcastic, neutral, or mixed reviews that a lexicon-based method cannot interpret perfectly. Therefore, the VADER comparison supports Hypothesis 4 only partially: written sentiment and Steam recommendation are related, but they are not identical.</w:t>
+      </w:r>
+    </w:p>
+    <w:p>
+      <w:pPr>
+        <w:spacing w:before="100" w:beforeAutospacing="1" w:after="100" w:afterAutospacing="1" w:line="360" w:lineRule="auto"/>
+        <w:jc w:val="both"/>
+        <w:rPr>
+          <w:rFonts w:eastAsia="Times New Roman"/>
+          <w:kern w:val="0"/>
+          <w:lang w:val="en-US" w:eastAsia="en-US"/>
+          <w14:ligatures w14:val="none"/>
+        </w:rPr>
+      </w:pPr>
+      <w:r>
+        <w:rPr>
+          <w:rFonts w:eastAsia="Times New Roman"/>
+          <w:kern w:val="0"/>
+          <w:lang w:val="en-US" w:eastAsia="en-US"/>
+          <w14:ligatures w14:val="none"/>
+        </w:rPr>
+        <w:lastRenderedPageBreak/>
+        <w:t>The VADER 3-class distribution is also used to create the target labels for the additional multi-class sentiment classification experiment. The distribution contains 6,659 Negative reviews, 6,224 Neutral reviews</w:t>
+      </w:r>
+      <w:r>
+        <w:rPr>
+          <w:rFonts w:eastAsia="Times New Roman"/>
+          <w:kern w:val="0"/>
+          <w:lang w:val="en-US" w:eastAsia="en-US"/>
+          <w14:ligatures w14:val="none"/>
+        </w:rPr>
+        <w:t xml:space="preserve"> </w:t>
+      </w:r>
+      <w:r>
+        <w:rPr>
+          <w:rFonts w:eastAsia="Times New Roman"/>
+          <w:kern w:val="0"/>
+          <w:lang w:val="en-US" w:eastAsia="en-US"/>
+          <w14:ligatures w14:val="none"/>
+        </w:rPr>
+        <w:t>and 7,167 Positive reviews. These values represent 33.21%</w:t>
+      </w:r>
+      <w:r>
+        <w:rPr>
+          <w:rFonts w:eastAsia="Times New Roman"/>
+          <w:kern w:val="0"/>
+          <w:lang w:val="en-US" w:eastAsia="en-US"/>
+          <w14:ligatures w14:val="none"/>
+        </w:rPr>
+        <w:t>,</w:t>
+      </w:r>
+      <w:r>
+        <w:rPr>
+          <w:rFonts w:eastAsia="Times New Roman"/>
+          <w:kern w:val="0"/>
+          <w:lang w:val="en-US" w:eastAsia="en-US"/>
+          <w14:ligatures w14:val="none"/>
+        </w:rPr>
+        <w:t xml:space="preserve"> 31.04% and 35.75% of the cleaned dataset respectively. This shows that the VADER-derived written sentiment labels are relatively balanced across the three classes.</w:t>
+      </w:r>
+    </w:p>
+    <w:p>
+      <w:pPr>
+        <w:spacing w:before="100" w:beforeAutospacing="1" w:after="100" w:afterAutospacing="1" w:line="360" w:lineRule="auto"/>
+        <w:jc w:val="both"/>
+        <w:rPr>
+          <w:rFonts w:eastAsia="Times New Roman"/>
+          <w:kern w:val="0"/>
+          <w:lang w:val="en-US" w:eastAsia="en-US"/>
+          <w14:ligatures w14:val="none"/>
+        </w:rPr>
+      </w:pPr>
+      <w:r>
+        <w:rPr>
+          <w:noProof/>
+        </w:rPr>
+        <w:drawing>
+          <wp:inline distT="0" distB="0" distL="0" distR="0" wp14:anchorId="5E965870" wp14:editId="67219286">
+            <wp:extent cx="5274310" cy="3722370"/>
+            <wp:effectExtent l="0" t="0" r="2540" b="0"/>
+            <wp:docPr id="1233363861" name="Picture 2"/>
+            <wp:cNvGraphicFramePr>
+              <a:graphicFrameLocks xmlns:a="http://schemas.openxmlformats.org/drawingml/2006/main" noChangeAspect="1"/>
+            </wp:cNvGraphicFramePr>
+            <a:graphic xmlns:a="http://schemas.openxmlformats.org/drawingml/2006/main">
+              <a:graphicData uri="http://schemas.openxmlformats.org/drawingml/2006/picture">
+                <pic:pic xmlns:pic="http://schemas.openxmlformats.org/drawingml/2006/picture">
+                  <pic:nvPicPr>
+                    <pic:cNvPr id="0" name="Picture 6"/>
+                    <pic:cNvPicPr>
+                      <a:picLocks noChangeAspect="1" noChangeArrowheads="1"/>
+                    </pic:cNvPicPr>
+                  </pic:nvPicPr>
+                  <pic:blipFill>
+                    <a:blip r:embed="rId15" cstate="print">
+                      <a:extLst>
+                        <a:ext uri="{28A0092B-C50C-407E-A947-70E740481C1C}">
+                          <a14:useLocalDpi xmlns:a14="http://schemas.microsoft.com/office/drawing/2010/main" val="0"/>
+                        </a:ext>
+                      </a:extLst>
+                    </a:blip>
+                    <a:srcRect/>
+                    <a:stretch>
+                      <a:fillRect/>
+                    </a:stretch>
+                  </pic:blipFill>
+                  <pic:spPr bwMode="auto">
+                    <a:xfrm>
+                      <a:off x="0" y="0"/>
+                      <a:ext cx="5274310" cy="3722370"/>
+                    </a:xfrm>
+                    <a:prstGeom prst="rect">
+                      <a:avLst/>
+                    </a:prstGeom>
+                    <a:noFill/>
+                    <a:ln>
+                      <a:noFill/>
+                    </a:ln>
+                  </pic:spPr>
+                </pic:pic>
+              </a:graphicData>
+            </a:graphic>
+          </wp:inline>
+        </w:drawing>
+      </w:r>
+    </w:p>
+    <w:p>
+      <w:pPr>
+        <w:pStyle w:val="Caption"/>
+        <w:jc w:val="center"/>
+        <w:rPr>
+          <w:lang w:val="en-US"/>
+        </w:rPr>
+      </w:pPr>
+      <w:r>
+        <w:t xml:space="preserve">Figure </w:t>
+      </w:r>
+      <w:r>
+        <w:fldChar w:fldCharType="begin"/>
+      </w:r>
+      <w:r>
+        <w:instrText xml:space="preserve"> STYLEREF 1 \s </w:instrText>
+      </w:r>
+      <w:r>
+        <w:fldChar w:fldCharType="separate"/>
+      </w:r>
+      <w:r>
+        <w:rPr>
+          <w:noProof/>
+          <w:cs/>
+        </w:rPr>
+        <w:t>‎</w:t>
+      </w:r>
+      <w:r>
+        <w:rPr>
+          <w:noProof/>
+        </w:rPr>
+        <w:t>5</w:t>
+      </w:r>
+      <w:r>
+        <w:fldChar w:fldCharType="end"/>
+      </w:r>
+      <w:r>
+        <w:t>.</w:t>
+      </w:r>
+      <w:r>
+        <w:fldChar w:fldCharType="begin"/>
+      </w:r>
+      <w:r>
+        <w:instrText xml:space="preserve"> SEQ Figure \* ARABIC \s 1 </w:instrText>
+      </w:r>
+      <w:r>
+        <w:fldChar w:fldCharType="separate"/>
+      </w:r>
+      <w:r>
+        <w:rPr>
+          <w:noProof/>
+        </w:rPr>
+        <w:t>4</w:t>
+      </w:r>
+      <w:r>
+        <w:fldChar w:fldCharType="end"/>
+      </w:r>
+      <w:r>
+        <w:rPr>
+          <w:lang w:val="en-US"/>
+        </w:rPr>
         <w:t>: Distribution of VADER-derived multiclass sentiment labels</w:t>
+      </w:r>
+    </w:p>
+    <w:p>
+      <w:pPr>
+        <w:spacing w:before="100" w:beforeAutospacing="1" w:after="100" w:afterAutospacing="1" w:line="360" w:lineRule="auto"/>
+        <w:jc w:val="both"/>
+        <w:rPr>
+          <w:rFonts w:eastAsia="Times New Roman"/>
+          <w:kern w:val="0"/>
+          <w:lang w:val="en-US" w:eastAsia="en-US"/>
+          <w14:ligatures w14:val="none"/>
+        </w:rPr>
+      </w:pPr>
+      <w:r>
+        <w:rPr>
+          <w:rFonts w:eastAsia="Times New Roman"/>
+          <w:kern w:val="0"/>
+          <w:lang w:val="en-US" w:eastAsia="en-US"/>
+          <w14:ligatures w14:val="none"/>
+        </w:rPr>
+        <w:t xml:space="preserve">However, these multi-class labels must be interpreted carefully. They are weak labels generated by a lexicon-based sentiment method, not manually annotated human labels. Therefore, they represent VADER-style written polarity rather than true human-labelled emotion. This is different from the binary </w:t>
+      </w:r>
+      <w:proofErr w:type="spellStart"/>
+      <w:r>
+        <w:rPr>
+          <w:rFonts w:eastAsia="Times New Roman"/>
+          <w:kern w:val="0"/>
+          <w:lang w:val="en-US" w:eastAsia="en-US"/>
+          <w14:ligatures w14:val="none"/>
+        </w:rPr>
+        <w:t>voted_up</w:t>
+      </w:r>
+      <w:proofErr w:type="spellEnd"/>
+      <w:r>
+        <w:rPr>
+          <w:rFonts w:eastAsia="Times New Roman"/>
+          <w:kern w:val="0"/>
+          <w:lang w:val="en-US" w:eastAsia="en-US"/>
+          <w14:ligatures w14:val="none"/>
+        </w:rPr>
+        <w:t xml:space="preserve"> task, where the model predicts the actual Steam recommendation outcome. The binary task remains the main supervised task because it uses the real label provided in the dataset, while the multi-class task is added to compare how different models perform when Neutral sentiment is included.</w:t>
       </w:r>
     </w:p>
     <w:p>
@@ -8697,12 +8835,6 @@
           <w:lang w:val="en-US"/>
         </w:rPr>
       </w:pPr>
-      <w:r>
-        <w:rPr>
-          <w:lang w:val="en-US"/>
-        </w:rPr>
-        <w:br w:type="page"/>
-      </w:r>
     </w:p>
     <w:p>
       <w:pPr>
@@ -8873,7 +9005,7 @@
                     </pic:cNvPicPr>
                   </pic:nvPicPr>
                   <pic:blipFill>
-                    <a:blip r:embed="rId15">
+                    <a:blip r:embed="rId16">
                       <a:extLst>
                         <a:ext uri="{28A0092B-C50C-407E-A947-70E740481C1C}">
                           <a14:useLocalDpi xmlns:a14="http://schemas.microsoft.com/office/drawing/2010/main" val="0"/>
@@ -8989,276 +9121,6 @@
                 <pic:pic xmlns:pic="http://schemas.openxmlformats.org/drawingml/2006/picture">
                   <pic:nvPicPr>
                     <pic:cNvPr id="0" name="Picture 7"/>
-                    <pic:cNvPicPr>
-                      <a:picLocks noChangeAspect="1" noChangeArrowheads="1"/>
-                    </pic:cNvPicPr>
-                  </pic:nvPicPr>
-                  <pic:blipFill>
-                    <a:blip r:embed="rId16" cstate="print">
-                      <a:extLst>
-                        <a:ext uri="{28A0092B-C50C-407E-A947-70E740481C1C}">
-                          <a14:useLocalDpi xmlns:a14="http://schemas.microsoft.com/office/drawing/2010/main" val="0"/>
-                        </a:ext>
-                      </a:extLst>
-                    </a:blip>
-                    <a:srcRect/>
-                    <a:stretch>
-                      <a:fillRect/>
-                    </a:stretch>
-                  </pic:blipFill>
-                  <pic:spPr bwMode="auto">
-                    <a:xfrm>
-                      <a:off x="0" y="0"/>
-                      <a:ext cx="5274310" cy="1703705"/>
-                    </a:xfrm>
-                    <a:prstGeom prst="rect">
-                      <a:avLst/>
-                    </a:prstGeom>
-                    <a:noFill/>
-                    <a:ln>
-                      <a:noFill/>
-                    </a:ln>
-                  </pic:spPr>
-                </pic:pic>
-              </a:graphicData>
-            </a:graphic>
-          </wp:inline>
-        </w:drawing>
-      </w:r>
-    </w:p>
-    <w:p>
-      <w:pPr>
-        <w:pStyle w:val="Caption"/>
-        <w:jc w:val="center"/>
-      </w:pPr>
-      <w:r>
-        <w:t xml:space="preserve">Figure </w:t>
-      </w:r>
-      <w:fldSimple w:instr=" STYLEREF 1 \s ">
-        <w:r>
-          <w:rPr>
-            <w:noProof/>
-            <w:cs/>
-          </w:rPr>
-          <w:t>‎</w:t>
-        </w:r>
-        <w:r>
-          <w:rPr>
-            <w:noProof/>
-          </w:rPr>
-          <w:t>6</w:t>
-        </w:r>
-      </w:fldSimple>
-      <w:r>
-        <w:t>.</w:t>
-      </w:r>
-      <w:fldSimple w:instr=" SEQ Figure \* ARABIC \s 1 ">
-        <w:r>
-          <w:rPr>
-            <w:noProof/>
-          </w:rPr>
-          <w:t>2</w:t>
-        </w:r>
-      </w:fldSimple>
-      <w:r>
-        <w:rPr>
-          <w:lang w:val="en-US"/>
-        </w:rPr>
-        <w:t>:</w:t>
-      </w:r>
-      <w:r>
-        <w:rPr>
-          <w:lang w:val="en-US"/>
-        </w:rPr>
-        <w:t xml:space="preserve"> Training and validation loss/accuracy history for the </w:t>
-      </w:r>
-      <w:proofErr w:type="spellStart"/>
-      <w:r>
-        <w:rPr>
-          <w:lang w:val="en-US"/>
-        </w:rPr>
-        <w:t>BiLSTM</w:t>
-      </w:r>
-      <w:proofErr w:type="spellEnd"/>
-      <w:r>
-        <w:rPr>
-          <w:lang w:val="en-US"/>
-        </w:rPr>
-        <w:t xml:space="preserve"> neural network.</w:t>
-      </w:r>
-    </w:p>
-    <w:p>
-      <w:pPr>
-        <w:spacing w:line="360" w:lineRule="auto"/>
-        <w:jc w:val="both"/>
-        <w:rPr>
-          <w:lang w:val="en-US"/>
-        </w:rPr>
-      </w:pPr>
-      <w:r>
-        <w:rPr>
-          <w:lang w:val="en-US"/>
-        </w:rPr>
-        <w:t xml:space="preserve">The </w:t>
-      </w:r>
-      <w:proofErr w:type="spellStart"/>
-      <w:r>
-        <w:rPr>
-          <w:lang w:val="en-US"/>
-        </w:rPr>
-        <w:t>BiLSTM</w:t>
-      </w:r>
-      <w:proofErr w:type="spellEnd"/>
-      <w:r>
-        <w:rPr>
-          <w:lang w:val="en-US"/>
-        </w:rPr>
-        <w:t xml:space="preserve"> model is also adapted for the multi-class sentiment classification experiment. In the binary task, the </w:t>
-      </w:r>
-      <w:proofErr w:type="spellStart"/>
-      <w:r>
-        <w:rPr>
-          <w:lang w:val="en-US"/>
-        </w:rPr>
-        <w:t>BiLSTM</w:t>
-      </w:r>
-      <w:proofErr w:type="spellEnd"/>
-      <w:r>
-        <w:rPr>
-          <w:lang w:val="en-US"/>
-        </w:rPr>
-        <w:t xml:space="preserve"> uses a sigmoid output layer to predict whether a review is positive or negative based on the Steam </w:t>
-      </w:r>
-      <w:proofErr w:type="spellStart"/>
-      <w:r>
-        <w:rPr>
-          <w:lang w:val="en-US"/>
-        </w:rPr>
-        <w:t>voted_up</w:t>
-      </w:r>
-      <w:proofErr w:type="spellEnd"/>
-      <w:r>
-        <w:rPr>
-          <w:lang w:val="en-US"/>
-        </w:rPr>
-        <w:t xml:space="preserve"> label. For the multi-class task, the output layer is changed to a </w:t>
-      </w:r>
-      <w:proofErr w:type="spellStart"/>
-      <w:r>
-        <w:rPr>
-          <w:lang w:val="en-US"/>
-        </w:rPr>
-        <w:t>softmax</w:t>
-      </w:r>
-      <w:proofErr w:type="spellEnd"/>
-      <w:r>
-        <w:rPr>
-          <w:lang w:val="en-US"/>
-        </w:rPr>
-        <w:t xml:space="preserve"> layer with three output units: </w:t>
-      </w:r>
-      <w:r>
-        <w:rPr>
-          <w:lang w:val="en-US"/>
-        </w:rPr>
-        <w:lastRenderedPageBreak/>
-        <w:t>Negative, Neutral, and Positive. This allows the model to predict one of the three VADER-derived sentiment categories.</w:t>
-      </w:r>
-    </w:p>
-    <w:p>
-      <w:pPr>
-        <w:spacing w:line="360" w:lineRule="auto"/>
-        <w:jc w:val="both"/>
-        <w:rPr>
-          <w:lang w:val="en-US"/>
-        </w:rPr>
-      </w:pPr>
-      <w:r>
-        <w:rPr>
-          <w:lang w:val="en-US"/>
-        </w:rPr>
-        <w:t xml:space="preserve">The multi-class </w:t>
-      </w:r>
-      <w:proofErr w:type="spellStart"/>
-      <w:r>
-        <w:rPr>
-          <w:lang w:val="en-US"/>
-        </w:rPr>
-        <w:t>BiLSTM</w:t>
-      </w:r>
-      <w:proofErr w:type="spellEnd"/>
-      <w:r>
-        <w:rPr>
-          <w:lang w:val="en-US"/>
-        </w:rPr>
-        <w:t xml:space="preserve"> achieved an accuracy of 0.8429, macro F1-score of 0.8450, and </w:t>
-      </w:r>
-      <w:proofErr w:type="gramStart"/>
-      <w:r>
-        <w:rPr>
-          <w:lang w:val="en-US"/>
-        </w:rPr>
-        <w:t>weighted</w:t>
-      </w:r>
-      <w:proofErr w:type="gramEnd"/>
-      <w:r>
-        <w:rPr>
-          <w:lang w:val="en-US"/>
-        </w:rPr>
-        <w:t xml:space="preserve"> F1-score of 0.8436. This result shows that the </w:t>
-      </w:r>
-      <w:proofErr w:type="spellStart"/>
-      <w:r>
-        <w:rPr>
-          <w:lang w:val="en-US"/>
-        </w:rPr>
-        <w:t>BiLSTM</w:t>
-      </w:r>
-      <w:proofErr w:type="spellEnd"/>
-      <w:r>
-        <w:rPr>
-          <w:lang w:val="en-US"/>
-        </w:rPr>
-        <w:t xml:space="preserve"> can learn useful patterns from the review text for three-class written sentiment classification. However, the labels used in this experiment are generated from VADER compound scores, so the result should be understood as the model’s ability to reproduce VADER-</w:t>
-      </w:r>
-      <w:proofErr w:type="gramStart"/>
-      <w:r>
-        <w:rPr>
-          <w:lang w:val="en-US"/>
-        </w:rPr>
-        <w:t>style polarity</w:t>
-      </w:r>
-      <w:proofErr w:type="gramEnd"/>
-      <w:r>
-        <w:rPr>
-          <w:lang w:val="en-US"/>
-        </w:rPr>
-        <w:t xml:space="preserve"> categories rather than true human-labelled sentiment.</w:t>
-      </w:r>
-    </w:p>
-    <w:p>
-      <w:pPr>
-        <w:keepNext/>
-        <w:spacing w:line="360" w:lineRule="auto"/>
-        <w:jc w:val="both"/>
-      </w:pPr>
-      <w:r>
-        <w:rPr>
-          <w:noProof/>
-        </w:rPr>
-        <w:drawing>
-          <wp:inline distT="0" distB="0" distL="0" distR="0" wp14:anchorId="209C3134" wp14:editId="19A98891">
-            <wp:extent cx="5274310" cy="1703705"/>
-            <wp:effectExtent l="0" t="0" r="2540" b="0"/>
-            <wp:docPr id="1351153964" name="Picture 4"/>
-            <wp:cNvGraphicFramePr>
-              <a:graphicFrameLocks xmlns:a="http://schemas.openxmlformats.org/drawingml/2006/main" noChangeAspect="1"/>
-            </wp:cNvGraphicFramePr>
-            <a:graphic xmlns:a="http://schemas.openxmlformats.org/drawingml/2006/main">
-              <a:graphicData uri="http://schemas.openxmlformats.org/drawingml/2006/picture">
-                <pic:pic xmlns:pic="http://schemas.openxmlformats.org/drawingml/2006/picture">
-                  <pic:nvPicPr>
-                    <pic:cNvPr id="0" name="Picture 10"/>
                     <pic:cNvPicPr>
                       <a:picLocks noChangeAspect="1" noChangeArrowheads="1"/>
                     </pic:cNvPicPr>
@@ -9327,6 +9189,276 @@
           <w:rPr>
             <w:noProof/>
           </w:rPr>
+          <w:t>2</w:t>
+        </w:r>
+      </w:fldSimple>
+      <w:r>
+        <w:rPr>
+          <w:lang w:val="en-US"/>
+        </w:rPr>
+        <w:t>:</w:t>
+      </w:r>
+      <w:r>
+        <w:rPr>
+          <w:lang w:val="en-US"/>
+        </w:rPr>
+        <w:t xml:space="preserve"> Training and validation loss/accuracy history for the </w:t>
+      </w:r>
+      <w:proofErr w:type="spellStart"/>
+      <w:r>
+        <w:rPr>
+          <w:lang w:val="en-US"/>
+        </w:rPr>
+        <w:t>BiLSTM</w:t>
+      </w:r>
+      <w:proofErr w:type="spellEnd"/>
+      <w:r>
+        <w:rPr>
+          <w:lang w:val="en-US"/>
+        </w:rPr>
+        <w:t xml:space="preserve"> neural network.</w:t>
+      </w:r>
+    </w:p>
+    <w:p>
+      <w:pPr>
+        <w:spacing w:line="360" w:lineRule="auto"/>
+        <w:jc w:val="both"/>
+        <w:rPr>
+          <w:lang w:val="en-US"/>
+        </w:rPr>
+      </w:pPr>
+      <w:r>
+        <w:rPr>
+          <w:lang w:val="en-US"/>
+        </w:rPr>
+        <w:t xml:space="preserve">The </w:t>
+      </w:r>
+      <w:proofErr w:type="spellStart"/>
+      <w:r>
+        <w:rPr>
+          <w:lang w:val="en-US"/>
+        </w:rPr>
+        <w:t>BiLSTM</w:t>
+      </w:r>
+      <w:proofErr w:type="spellEnd"/>
+      <w:r>
+        <w:rPr>
+          <w:lang w:val="en-US"/>
+        </w:rPr>
+        <w:t xml:space="preserve"> model is also adapted for the multi-class sentiment classification experiment. In the binary task, the </w:t>
+      </w:r>
+      <w:proofErr w:type="spellStart"/>
+      <w:r>
+        <w:rPr>
+          <w:lang w:val="en-US"/>
+        </w:rPr>
+        <w:t>BiLSTM</w:t>
+      </w:r>
+      <w:proofErr w:type="spellEnd"/>
+      <w:r>
+        <w:rPr>
+          <w:lang w:val="en-US"/>
+        </w:rPr>
+        <w:t xml:space="preserve"> uses a sigmoid output layer to predict whether a review is positive or negative based on the Steam </w:t>
+      </w:r>
+      <w:proofErr w:type="spellStart"/>
+      <w:r>
+        <w:rPr>
+          <w:lang w:val="en-US"/>
+        </w:rPr>
+        <w:t>voted_up</w:t>
+      </w:r>
+      <w:proofErr w:type="spellEnd"/>
+      <w:r>
+        <w:rPr>
+          <w:lang w:val="en-US"/>
+        </w:rPr>
+        <w:t xml:space="preserve"> label. For the multi-class task, the output layer is changed to a </w:t>
+      </w:r>
+      <w:proofErr w:type="spellStart"/>
+      <w:r>
+        <w:rPr>
+          <w:lang w:val="en-US"/>
+        </w:rPr>
+        <w:t>softmax</w:t>
+      </w:r>
+      <w:proofErr w:type="spellEnd"/>
+      <w:r>
+        <w:rPr>
+          <w:lang w:val="en-US"/>
+        </w:rPr>
+        <w:t xml:space="preserve"> layer with three output units: </w:t>
+      </w:r>
+      <w:r>
+        <w:rPr>
+          <w:lang w:val="en-US"/>
+        </w:rPr>
+        <w:lastRenderedPageBreak/>
+        <w:t>Negative, Neutral, and Positive. This allows the model to predict one of the three VADER-derived sentiment categories.</w:t>
+      </w:r>
+    </w:p>
+    <w:p>
+      <w:pPr>
+        <w:spacing w:line="360" w:lineRule="auto"/>
+        <w:jc w:val="both"/>
+        <w:rPr>
+          <w:lang w:val="en-US"/>
+        </w:rPr>
+      </w:pPr>
+      <w:r>
+        <w:rPr>
+          <w:lang w:val="en-US"/>
+        </w:rPr>
+        <w:t xml:space="preserve">The multi-class </w:t>
+      </w:r>
+      <w:proofErr w:type="spellStart"/>
+      <w:r>
+        <w:rPr>
+          <w:lang w:val="en-US"/>
+        </w:rPr>
+        <w:t>BiLSTM</w:t>
+      </w:r>
+      <w:proofErr w:type="spellEnd"/>
+      <w:r>
+        <w:rPr>
+          <w:lang w:val="en-US"/>
+        </w:rPr>
+        <w:t xml:space="preserve"> achieved an accuracy of 0.8429, macro F1-score of 0.8450, and </w:t>
+      </w:r>
+      <w:proofErr w:type="gramStart"/>
+      <w:r>
+        <w:rPr>
+          <w:lang w:val="en-US"/>
+        </w:rPr>
+        <w:t>weighted</w:t>
+      </w:r>
+      <w:proofErr w:type="gramEnd"/>
+      <w:r>
+        <w:rPr>
+          <w:lang w:val="en-US"/>
+        </w:rPr>
+        <w:t xml:space="preserve"> F1-score of 0.8436. This result shows that the </w:t>
+      </w:r>
+      <w:proofErr w:type="spellStart"/>
+      <w:r>
+        <w:rPr>
+          <w:lang w:val="en-US"/>
+        </w:rPr>
+        <w:t>BiLSTM</w:t>
+      </w:r>
+      <w:proofErr w:type="spellEnd"/>
+      <w:r>
+        <w:rPr>
+          <w:lang w:val="en-US"/>
+        </w:rPr>
+        <w:t xml:space="preserve"> can learn useful patterns from the review text for three-class written sentiment classification. However, the labels used in this experiment are generated from VADER compound scores, so the result should be understood as the model’s ability to reproduce VADER-</w:t>
+      </w:r>
+      <w:proofErr w:type="gramStart"/>
+      <w:r>
+        <w:rPr>
+          <w:lang w:val="en-US"/>
+        </w:rPr>
+        <w:t>style polarity</w:t>
+      </w:r>
+      <w:proofErr w:type="gramEnd"/>
+      <w:r>
+        <w:rPr>
+          <w:lang w:val="en-US"/>
+        </w:rPr>
+        <w:t xml:space="preserve"> categories rather than true human-labelled sentiment.</w:t>
+      </w:r>
+    </w:p>
+    <w:p>
+      <w:pPr>
+        <w:keepNext/>
+        <w:spacing w:line="360" w:lineRule="auto"/>
+        <w:jc w:val="both"/>
+      </w:pPr>
+      <w:r>
+        <w:rPr>
+          <w:noProof/>
+        </w:rPr>
+        <w:drawing>
+          <wp:inline distT="0" distB="0" distL="0" distR="0" wp14:anchorId="209C3134" wp14:editId="19A98891">
+            <wp:extent cx="5274310" cy="1703705"/>
+            <wp:effectExtent l="0" t="0" r="2540" b="0"/>
+            <wp:docPr id="1351153964" name="Picture 4"/>
+            <wp:cNvGraphicFramePr>
+              <a:graphicFrameLocks xmlns:a="http://schemas.openxmlformats.org/drawingml/2006/main" noChangeAspect="1"/>
+            </wp:cNvGraphicFramePr>
+            <a:graphic xmlns:a="http://schemas.openxmlformats.org/drawingml/2006/main">
+              <a:graphicData uri="http://schemas.openxmlformats.org/drawingml/2006/picture">
+                <pic:pic xmlns:pic="http://schemas.openxmlformats.org/drawingml/2006/picture">
+                  <pic:nvPicPr>
+                    <pic:cNvPr id="0" name="Picture 10"/>
+                    <pic:cNvPicPr>
+                      <a:picLocks noChangeAspect="1" noChangeArrowheads="1"/>
+                    </pic:cNvPicPr>
+                  </pic:nvPicPr>
+                  <pic:blipFill>
+                    <a:blip r:embed="rId18" cstate="print">
+                      <a:extLst>
+                        <a:ext uri="{28A0092B-C50C-407E-A947-70E740481C1C}">
+                          <a14:useLocalDpi xmlns:a14="http://schemas.microsoft.com/office/drawing/2010/main" val="0"/>
+                        </a:ext>
+                      </a:extLst>
+                    </a:blip>
+                    <a:srcRect/>
+                    <a:stretch>
+                      <a:fillRect/>
+                    </a:stretch>
+                  </pic:blipFill>
+                  <pic:spPr bwMode="auto">
+                    <a:xfrm>
+                      <a:off x="0" y="0"/>
+                      <a:ext cx="5274310" cy="1703705"/>
+                    </a:xfrm>
+                    <a:prstGeom prst="rect">
+                      <a:avLst/>
+                    </a:prstGeom>
+                    <a:noFill/>
+                    <a:ln>
+                      <a:noFill/>
+                    </a:ln>
+                  </pic:spPr>
+                </pic:pic>
+              </a:graphicData>
+            </a:graphic>
+          </wp:inline>
+        </w:drawing>
+      </w:r>
+    </w:p>
+    <w:p>
+      <w:pPr>
+        <w:pStyle w:val="Caption"/>
+        <w:jc w:val="center"/>
+      </w:pPr>
+      <w:r>
+        <w:t xml:space="preserve">Figure </w:t>
+      </w:r>
+      <w:fldSimple w:instr=" STYLEREF 1 \s ">
+        <w:r>
+          <w:rPr>
+            <w:noProof/>
+            <w:cs/>
+          </w:rPr>
+          <w:t>‎</w:t>
+        </w:r>
+        <w:r>
+          <w:rPr>
+            <w:noProof/>
+          </w:rPr>
+          <w:t>6</w:t>
+        </w:r>
+      </w:fldSimple>
+      <w:r>
+        <w:t>.</w:t>
+      </w:r>
+      <w:fldSimple w:instr=" SEQ Figure \* ARABIC \s 1 ">
+        <w:r>
+          <w:rPr>
+            <w:noProof/>
+          </w:rPr>
           <w:t>3</w:t>
         </w:r>
       </w:fldSimple>
@@ -9385,7 +9517,7 @@
                     </pic:cNvPicPr>
                   </pic:nvPicPr>
                   <pic:blipFill>
-                    <a:blip r:embed="rId18" cstate="print">
+                    <a:blip r:embed="rId19" cstate="print">
                       <a:extLst>
                         <a:ext uri="{28A0092B-C50C-407E-A947-70E740481C1C}">
                           <a14:useLocalDpi xmlns:a14="http://schemas.microsoft.com/office/drawing/2010/main" val="0"/>
@@ -10468,7 +10600,7 @@
                     </pic:cNvPicPr>
                   </pic:nvPicPr>
                   <pic:blipFill>
-                    <a:blip r:embed="rId19" cstate="print">
+                    <a:blip r:embed="rId20" cstate="print">
                       <a:extLst>
                         <a:ext uri="{28A0092B-C50C-407E-A947-70E740481C1C}">
                           <a14:useLocalDpi xmlns:a14="http://schemas.microsoft.com/office/drawing/2010/main" val="0"/>
@@ -10619,123 +10751,6 @@
                 <pic:pic xmlns:pic="http://schemas.openxmlformats.org/drawingml/2006/picture">
                   <pic:nvPicPr>
                     <pic:cNvPr id="0" name="Picture 3"/>
-                    <pic:cNvPicPr>
-                      <a:picLocks noChangeAspect="1" noChangeArrowheads="1"/>
-                    </pic:cNvPicPr>
-                  </pic:nvPicPr>
-                  <pic:blipFill>
-                    <a:blip r:embed="rId20" cstate="print">
-                      <a:extLst>
-                        <a:ext uri="{28A0092B-C50C-407E-A947-70E740481C1C}">
-                          <a14:useLocalDpi xmlns:a14="http://schemas.microsoft.com/office/drawing/2010/main" val="0"/>
-                        </a:ext>
-                      </a:extLst>
-                    </a:blip>
-                    <a:srcRect/>
-                    <a:stretch>
-                      <a:fillRect/>
-                    </a:stretch>
-                  </pic:blipFill>
-                  <pic:spPr bwMode="auto">
-                    <a:xfrm>
-                      <a:off x="0" y="0"/>
-                      <a:ext cx="5274310" cy="3247390"/>
-                    </a:xfrm>
-                    <a:prstGeom prst="rect">
-                      <a:avLst/>
-                    </a:prstGeom>
-                    <a:noFill/>
-                    <a:ln>
-                      <a:noFill/>
-                    </a:ln>
-                  </pic:spPr>
-                </pic:pic>
-              </a:graphicData>
-            </a:graphic>
-          </wp:inline>
-        </w:drawing>
-      </w:r>
-    </w:p>
-    <w:p>
-      <w:pPr>
-        <w:pStyle w:val="Caption"/>
-        <w:jc w:val="center"/>
-      </w:pPr>
-      <w:r>
-        <w:t xml:space="preserve">Figure </w:t>
-      </w:r>
-      <w:fldSimple w:instr=" STYLEREF 1 \s ">
-        <w:r>
-          <w:rPr>
-            <w:noProof/>
-            <w:cs/>
-          </w:rPr>
-          <w:t>‎</w:t>
-        </w:r>
-        <w:r>
-          <w:rPr>
-            <w:noProof/>
-          </w:rPr>
-          <w:t>7</w:t>
-        </w:r>
-      </w:fldSimple>
-      <w:r>
-        <w:t>.</w:t>
-      </w:r>
-      <w:fldSimple w:instr=" SEQ Figure \* ARABIC \s 1 ">
-        <w:r>
-          <w:rPr>
-            <w:noProof/>
-          </w:rPr>
-          <w:t>2</w:t>
-        </w:r>
-      </w:fldSimple>
-      <w:r>
-        <w:rPr>
-          <w:lang w:val="en-US"/>
-        </w:rPr>
-        <w:t xml:space="preserve">: </w:t>
-      </w:r>
-      <w:r>
-        <w:rPr>
-          <w:lang w:val="en-US"/>
-        </w:rPr>
-        <w:t>Recent playtime hours by Steam review sentiment.</w:t>
-      </w:r>
-    </w:p>
-    <w:p>
-      <w:pPr>
-        <w:spacing w:line="360" w:lineRule="auto"/>
-        <w:jc w:val="both"/>
-      </w:pPr>
-      <w:r>
-        <w:t>Hypothesis 2 is also supported because negative reviewers had a higher median number of games owned, at 30 games compared with 16 games for positive reviewers. This may indicate that players with broader gaming experience are more critical in their evaluation.</w:t>
-      </w:r>
-    </w:p>
-    <w:p>
-      <w:pPr>
-        <w:keepNext/>
-        <w:spacing w:line="360" w:lineRule="auto"/>
-        <w:jc w:val="center"/>
-      </w:pPr>
-      <w:r>
-        <w:rPr>
-          <w:noProof/>
-        </w:rPr>
-        <w:lastRenderedPageBreak/>
-        <w:drawing>
-          <wp:inline distT="0" distB="0" distL="0" distR="0" wp14:anchorId="5D94173F" wp14:editId="4F4CB5F5">
-            <wp:extent cx="5274310" cy="3247390"/>
-            <wp:effectExtent l="0" t="0" r="2540" b="0"/>
-            <wp:docPr id="704570084" name="Picture 3"/>
-            <wp:cNvGraphicFramePr>
-              <a:graphicFrameLocks xmlns:a="http://schemas.openxmlformats.org/drawingml/2006/main" noChangeAspect="1"/>
-            </wp:cNvGraphicFramePr>
-            <a:graphic xmlns:a="http://schemas.openxmlformats.org/drawingml/2006/main">
-              <a:graphicData uri="http://schemas.openxmlformats.org/drawingml/2006/picture">
-                <pic:pic xmlns:pic="http://schemas.openxmlformats.org/drawingml/2006/picture">
-                  <pic:nvPicPr>
-                    <pic:cNvPr id="0" name="Picture 5"/>
                     <pic:cNvPicPr>
                       <a:picLocks noChangeAspect="1" noChangeArrowheads="1"/>
                     </pic:cNvPicPr>
@@ -10804,6 +10819,123 @@
           <w:rPr>
             <w:noProof/>
           </w:rPr>
+          <w:t>2</w:t>
+        </w:r>
+      </w:fldSimple>
+      <w:r>
+        <w:rPr>
+          <w:lang w:val="en-US"/>
+        </w:rPr>
+        <w:t xml:space="preserve">: </w:t>
+      </w:r>
+      <w:r>
+        <w:rPr>
+          <w:lang w:val="en-US"/>
+        </w:rPr>
+        <w:t>Recent playtime hours by Steam review sentiment.</w:t>
+      </w:r>
+    </w:p>
+    <w:p>
+      <w:pPr>
+        <w:spacing w:line="360" w:lineRule="auto"/>
+        <w:jc w:val="both"/>
+      </w:pPr>
+      <w:r>
+        <w:t>Hypothesis 2 is also supported because negative reviewers had a higher median number of games owned, at 30 games compared with 16 games for positive reviewers. This may indicate that players with broader gaming experience are more critical in their evaluation.</w:t>
+      </w:r>
+    </w:p>
+    <w:p>
+      <w:pPr>
+        <w:keepNext/>
+        <w:spacing w:line="360" w:lineRule="auto"/>
+        <w:jc w:val="center"/>
+      </w:pPr>
+      <w:r>
+        <w:rPr>
+          <w:noProof/>
+        </w:rPr>
+        <w:lastRenderedPageBreak/>
+        <w:drawing>
+          <wp:inline distT="0" distB="0" distL="0" distR="0" wp14:anchorId="5D94173F" wp14:editId="4F4CB5F5">
+            <wp:extent cx="5274310" cy="3247390"/>
+            <wp:effectExtent l="0" t="0" r="2540" b="0"/>
+            <wp:docPr id="704570084" name="Picture 3"/>
+            <wp:cNvGraphicFramePr>
+              <a:graphicFrameLocks xmlns:a="http://schemas.openxmlformats.org/drawingml/2006/main" noChangeAspect="1"/>
+            </wp:cNvGraphicFramePr>
+            <a:graphic xmlns:a="http://schemas.openxmlformats.org/drawingml/2006/main">
+              <a:graphicData uri="http://schemas.openxmlformats.org/drawingml/2006/picture">
+                <pic:pic xmlns:pic="http://schemas.openxmlformats.org/drawingml/2006/picture">
+                  <pic:nvPicPr>
+                    <pic:cNvPr id="0" name="Picture 5"/>
+                    <pic:cNvPicPr>
+                      <a:picLocks noChangeAspect="1" noChangeArrowheads="1"/>
+                    </pic:cNvPicPr>
+                  </pic:nvPicPr>
+                  <pic:blipFill>
+                    <a:blip r:embed="rId22" cstate="print">
+                      <a:extLst>
+                        <a:ext uri="{28A0092B-C50C-407E-A947-70E740481C1C}">
+                          <a14:useLocalDpi xmlns:a14="http://schemas.microsoft.com/office/drawing/2010/main" val="0"/>
+                        </a:ext>
+                      </a:extLst>
+                    </a:blip>
+                    <a:srcRect/>
+                    <a:stretch>
+                      <a:fillRect/>
+                    </a:stretch>
+                  </pic:blipFill>
+                  <pic:spPr bwMode="auto">
+                    <a:xfrm>
+                      <a:off x="0" y="0"/>
+                      <a:ext cx="5274310" cy="3247390"/>
+                    </a:xfrm>
+                    <a:prstGeom prst="rect">
+                      <a:avLst/>
+                    </a:prstGeom>
+                    <a:noFill/>
+                    <a:ln>
+                      <a:noFill/>
+                    </a:ln>
+                  </pic:spPr>
+                </pic:pic>
+              </a:graphicData>
+            </a:graphic>
+          </wp:inline>
+        </w:drawing>
+      </w:r>
+    </w:p>
+    <w:p>
+      <w:pPr>
+        <w:pStyle w:val="Caption"/>
+        <w:jc w:val="center"/>
+      </w:pPr>
+      <w:r>
+        <w:t xml:space="preserve">Figure </w:t>
+      </w:r>
+      <w:fldSimple w:instr=" STYLEREF 1 \s ">
+        <w:r>
+          <w:rPr>
+            <w:noProof/>
+            <w:cs/>
+          </w:rPr>
+          <w:t>‎</w:t>
+        </w:r>
+        <w:r>
+          <w:rPr>
+            <w:noProof/>
+          </w:rPr>
+          <w:t>7</w:t>
+        </w:r>
+      </w:fldSimple>
+      <w:r>
+        <w:t>.</w:t>
+      </w:r>
+      <w:fldSimple w:instr=" SEQ Figure \* ARABIC \s 1 ">
+        <w:r>
+          <w:rPr>
+            <w:noProof/>
+          </w:rPr>
           <w:t>3</w:t>
         </w:r>
       </w:fldSimple>
@@ -10857,7 +10989,7 @@
                     </pic:cNvPicPr>
                   </pic:nvPicPr>
                   <pic:blipFill>
-                    <a:blip r:embed="rId22" cstate="print">
+                    <a:blip r:embed="rId23" cstate="print">
                       <a:extLst>
                         <a:ext uri="{28A0092B-C50C-407E-A947-70E740481C1C}">
                           <a14:useLocalDpi xmlns:a14="http://schemas.microsoft.com/office/drawing/2010/main" val="0"/>
@@ -11479,115 +11611,6 @@
                 <pic:pic xmlns:pic="http://schemas.openxmlformats.org/drawingml/2006/picture">
                   <pic:nvPicPr>
                     <pic:cNvPr id="0" name="Picture 7"/>
-                    <pic:cNvPicPr>
-                      <a:picLocks noChangeAspect="1" noChangeArrowheads="1"/>
-                    </pic:cNvPicPr>
-                  </pic:nvPicPr>
-                  <pic:blipFill>
-                    <a:blip r:embed="rId23" cstate="print">
-                      <a:extLst>
-                        <a:ext uri="{28A0092B-C50C-407E-A947-70E740481C1C}">
-                          <a14:useLocalDpi xmlns:a14="http://schemas.microsoft.com/office/drawing/2010/main" val="0"/>
-                        </a:ext>
-                      </a:extLst>
-                    </a:blip>
-                    <a:srcRect/>
-                    <a:stretch>
-                      <a:fillRect/>
-                    </a:stretch>
-                  </pic:blipFill>
-                  <pic:spPr bwMode="auto">
-                    <a:xfrm>
-                      <a:off x="0" y="0"/>
-                      <a:ext cx="5274310" cy="3122930"/>
-                    </a:xfrm>
-                    <a:prstGeom prst="rect">
-                      <a:avLst/>
-                    </a:prstGeom>
-                    <a:noFill/>
-                    <a:ln>
-                      <a:noFill/>
-                    </a:ln>
-                  </pic:spPr>
-                </pic:pic>
-              </a:graphicData>
-            </a:graphic>
-          </wp:inline>
-        </w:drawing>
-      </w:r>
-    </w:p>
-    <w:p>
-      <w:pPr>
-        <w:pStyle w:val="Caption"/>
-        <w:jc w:val="center"/>
-        <w:rPr>
-          <w:lang w:val="en-US"/>
-        </w:rPr>
-      </w:pPr>
-      <w:r>
-        <w:t xml:space="preserve">Figure </w:t>
-      </w:r>
-      <w:fldSimple w:instr=" STYLEREF 1 \s ">
-        <w:r>
-          <w:rPr>
-            <w:noProof/>
-            <w:cs/>
-          </w:rPr>
-          <w:t>‎</w:t>
-        </w:r>
-        <w:r>
-          <w:rPr>
-            <w:noProof/>
-          </w:rPr>
-          <w:t>7</w:t>
-        </w:r>
-      </w:fldSimple>
-      <w:r>
-        <w:t>.</w:t>
-      </w:r>
-      <w:fldSimple w:instr=" SEQ Figure \* ARABIC \s 1 ">
-        <w:r>
-          <w:rPr>
-            <w:noProof/>
-          </w:rPr>
-          <w:t>5</w:t>
-        </w:r>
-      </w:fldSimple>
-      <w:r>
-        <w:rPr>
-          <w:lang w:val="en-US"/>
-        </w:rPr>
-        <w:t xml:space="preserve">: </w:t>
-      </w:r>
-      <w:r>
-        <w:rPr>
-          <w:lang w:val="en-US"/>
-        </w:rPr>
-        <w:t>Top positive opinion phrases in FIFA 23 Steam reviews.</w:t>
-      </w:r>
-    </w:p>
-    <w:p>
-      <w:pPr>
-        <w:keepNext/>
-        <w:jc w:val="center"/>
-      </w:pPr>
-      <w:r>
-        <w:rPr>
-          <w:noProof/>
-        </w:rPr>
-        <w:drawing>
-          <wp:inline distT="0" distB="0" distL="0" distR="0" wp14:anchorId="37780D9B" wp14:editId="58F9AB43">
-            <wp:extent cx="5274310" cy="3122930"/>
-            <wp:effectExtent l="0" t="0" r="2540" b="1270"/>
-            <wp:docPr id="486373861" name="Picture 5"/>
-            <wp:cNvGraphicFramePr>
-              <a:graphicFrameLocks xmlns:a="http://schemas.openxmlformats.org/drawingml/2006/main" noChangeAspect="1"/>
-            </wp:cNvGraphicFramePr>
-            <a:graphic xmlns:a="http://schemas.openxmlformats.org/drawingml/2006/main">
-              <a:graphicData uri="http://schemas.openxmlformats.org/drawingml/2006/picture">
-                <pic:pic xmlns:pic="http://schemas.openxmlformats.org/drawingml/2006/picture">
-                  <pic:nvPicPr>
-                    <pic:cNvPr id="0" name="Picture 9"/>
                     <pic:cNvPicPr>
                       <a:picLocks noChangeAspect="1" noChangeArrowheads="1"/>
                     </pic:cNvPicPr>
@@ -11659,6 +11682,115 @@
           <w:rPr>
             <w:noProof/>
           </w:rPr>
+          <w:t>5</w:t>
+        </w:r>
+      </w:fldSimple>
+      <w:r>
+        <w:rPr>
+          <w:lang w:val="en-US"/>
+        </w:rPr>
+        <w:t xml:space="preserve">: </w:t>
+      </w:r>
+      <w:r>
+        <w:rPr>
+          <w:lang w:val="en-US"/>
+        </w:rPr>
+        <w:t>Top positive opinion phrases in FIFA 23 Steam reviews.</w:t>
+      </w:r>
+    </w:p>
+    <w:p>
+      <w:pPr>
+        <w:keepNext/>
+        <w:jc w:val="center"/>
+      </w:pPr>
+      <w:r>
+        <w:rPr>
+          <w:noProof/>
+        </w:rPr>
+        <w:drawing>
+          <wp:inline distT="0" distB="0" distL="0" distR="0" wp14:anchorId="37780D9B" wp14:editId="58F9AB43">
+            <wp:extent cx="5274310" cy="3122930"/>
+            <wp:effectExtent l="0" t="0" r="2540" b="1270"/>
+            <wp:docPr id="486373861" name="Picture 5"/>
+            <wp:cNvGraphicFramePr>
+              <a:graphicFrameLocks xmlns:a="http://schemas.openxmlformats.org/drawingml/2006/main" noChangeAspect="1"/>
+            </wp:cNvGraphicFramePr>
+            <a:graphic xmlns:a="http://schemas.openxmlformats.org/drawingml/2006/main">
+              <a:graphicData uri="http://schemas.openxmlformats.org/drawingml/2006/picture">
+                <pic:pic xmlns:pic="http://schemas.openxmlformats.org/drawingml/2006/picture">
+                  <pic:nvPicPr>
+                    <pic:cNvPr id="0" name="Picture 9"/>
+                    <pic:cNvPicPr>
+                      <a:picLocks noChangeAspect="1" noChangeArrowheads="1"/>
+                    </pic:cNvPicPr>
+                  </pic:nvPicPr>
+                  <pic:blipFill>
+                    <a:blip r:embed="rId25" cstate="print">
+                      <a:extLst>
+                        <a:ext uri="{28A0092B-C50C-407E-A947-70E740481C1C}">
+                          <a14:useLocalDpi xmlns:a14="http://schemas.microsoft.com/office/drawing/2010/main" val="0"/>
+                        </a:ext>
+                      </a:extLst>
+                    </a:blip>
+                    <a:srcRect/>
+                    <a:stretch>
+                      <a:fillRect/>
+                    </a:stretch>
+                  </pic:blipFill>
+                  <pic:spPr bwMode="auto">
+                    <a:xfrm>
+                      <a:off x="0" y="0"/>
+                      <a:ext cx="5274310" cy="3122930"/>
+                    </a:xfrm>
+                    <a:prstGeom prst="rect">
+                      <a:avLst/>
+                    </a:prstGeom>
+                    <a:noFill/>
+                    <a:ln>
+                      <a:noFill/>
+                    </a:ln>
+                  </pic:spPr>
+                </pic:pic>
+              </a:graphicData>
+            </a:graphic>
+          </wp:inline>
+        </w:drawing>
+      </w:r>
+    </w:p>
+    <w:p>
+      <w:pPr>
+        <w:pStyle w:val="Caption"/>
+        <w:jc w:val="center"/>
+        <w:rPr>
+          <w:lang w:val="en-US"/>
+        </w:rPr>
+      </w:pPr>
+      <w:r>
+        <w:t xml:space="preserve">Figure </w:t>
+      </w:r>
+      <w:fldSimple w:instr=" STYLEREF 1 \s ">
+        <w:r>
+          <w:rPr>
+            <w:noProof/>
+            <w:cs/>
+          </w:rPr>
+          <w:t>‎</w:t>
+        </w:r>
+        <w:r>
+          <w:rPr>
+            <w:noProof/>
+          </w:rPr>
+          <w:t>7</w:t>
+        </w:r>
+      </w:fldSimple>
+      <w:r>
+        <w:t>.</w:t>
+      </w:r>
+      <w:fldSimple w:instr=" SEQ Figure \* ARABIC \s 1 ">
+        <w:r>
+          <w:rPr>
+            <w:noProof/>
+          </w:rPr>
           <w:t>6</w:t>
         </w:r>
       </w:fldSimple>
@@ -12245,7 +12377,7 @@
                     </pic:cNvPicPr>
                   </pic:nvPicPr>
                   <pic:blipFill>
-                    <a:blip r:embed="rId25" cstate="print">
+                    <a:blip r:embed="rId26" cstate="print">
                       <a:extLst>
                         <a:ext uri="{28A0092B-C50C-407E-A947-70E740481C1C}">
                           <a14:useLocalDpi xmlns:a14="http://schemas.microsoft.com/office/drawing/2010/main" val="0"/>
@@ -12368,7 +12500,7 @@
                     </pic:cNvPicPr>
                   </pic:nvPicPr>
                   <pic:blipFill>
-                    <a:blip r:embed="rId26" cstate="print">
+                    <a:blip r:embed="rId27" cstate="print">
                       <a:extLst>
                         <a:ext uri="{28A0092B-C50C-407E-A947-70E740481C1C}">
                           <a14:useLocalDpi xmlns:a14="http://schemas.microsoft.com/office/drawing/2010/main" val="0"/>
@@ -13212,7 +13344,7 @@
                     </pic:cNvPicPr>
                   </pic:nvPicPr>
                   <pic:blipFill>
-                    <a:blip r:embed="rId27" cstate="print">
+                    <a:blip r:embed="rId28" cstate="print">
                       <a:extLst>
                         <a:ext uri="{28A0092B-C50C-407E-A947-70E740481C1C}">
                           <a14:useLocalDpi xmlns:a14="http://schemas.microsoft.com/office/drawing/2010/main" val="0"/>
@@ -13321,7 +13453,7 @@
                     </pic:cNvPicPr>
                   </pic:nvPicPr>
                   <pic:blipFill>
-                    <a:blip r:embed="rId28">
+                    <a:blip r:embed="rId29">
                       <a:extLst>
                         <a:ext uri="{28A0092B-C50C-407E-A947-70E740481C1C}">
                           <a14:useLocalDpi xmlns:a14="http://schemas.microsoft.com/office/drawing/2010/main" val="0"/>
@@ -13441,7 +13573,7 @@
                     </pic:cNvPicPr>
                   </pic:nvPicPr>
                   <pic:blipFill>
-                    <a:blip r:embed="rId29" cstate="print">
+                    <a:blip r:embed="rId30" cstate="print">
                       <a:extLst>
                         <a:ext uri="{28A0092B-C50C-407E-A947-70E740481C1C}">
                           <a14:useLocalDpi xmlns:a14="http://schemas.microsoft.com/office/drawing/2010/main" val="0"/>
@@ -14397,7 +14529,7 @@
       <w:r>
         <w:t xml:space="preserve"> Documentation. Accessed: Jun. 1, 2026. [Online]. Available: </w:t>
       </w:r>
-      <w:hyperlink r:id="rId30" w:history="1">
+      <w:hyperlink r:id="rId31" w:history="1">
         <w:r>
           <w:rPr>
             <w:rStyle w:val="Hyperlink"/>
@@ -14432,7 +14564,7 @@
       <w:r>
         <w:t xml:space="preserve">, 3rd ed. draft, 2021. [Online]. Available: </w:t>
       </w:r>
-      <w:hyperlink r:id="rId31" w:tgtFrame="_new" w:history="1">
+      <w:hyperlink r:id="rId32" w:tgtFrame="_new" w:history="1">
         <w:r>
           <w:rPr>
             <w:rStyle w:val="Hyperlink"/>
@@ -14442,8 +14574,8 @@
       </w:hyperlink>
     </w:p>
     <w:sectPr>
-      <w:headerReference w:type="default" r:id="rId32"/>
-      <w:footerReference w:type="default" r:id="rId33"/>
+      <w:headerReference w:type="default" r:id="rId33"/>
+      <w:footerReference w:type="default" r:id="rId34"/>
       <w:pgSz w:w="11906" w:h="16838"/>
       <w:pgMar w:top="1440" w:right="1440" w:bottom="1440" w:left="2160" w:header="720" w:footer="720" w:gutter="0"/>
       <w:cols w:space="720"/>
@@ -18825,6 +18957,7 @@
   <w:style w:type="character" w:default="1" w:styleId="DefaultParagraphFont">
     <w:name w:val="Default Paragraph Font"/>
     <w:uiPriority w:val="1"/>
+    <w:semiHidden/>
     <w:unhideWhenUsed/>
   </w:style>
   <w:style w:type="table" w:default="1" w:styleId="TableNormal">
@@ -19739,12 +19872,7 @@
 </file>
 
 <file path=customXml/item1.xml><?xml version="1.0" encoding="utf-8"?>
-<?mso-contentType ?>
-<FormTemplates xmlns="http://schemas.microsoft.com/sharepoint/v3/contenttype/forms">
-  <Display>DocumentLibraryForm</Display>
-  <Edit>DocumentLibraryForm</Edit>
-  <New>DocumentLibraryForm</New>
-</FormTemplates>
+<b:Sources xmlns:b="http://schemas.openxmlformats.org/officeDocument/2006/bibliography" xmlns="http://schemas.openxmlformats.org/officeDocument/2006/bibliography" SelectedStyle="\APASixthEditionOfficeOnline.xsl" StyleName="APA" Version="6"/>
 </file>
 
 <file path=customXml/item2.xml><?xml version="1.0" encoding="utf-8"?>
@@ -19756,7 +19884,12 @@
 </file>
 
 <file path=customXml/item3.xml><?xml version="1.0" encoding="utf-8"?>
-<b:Sources xmlns:b="http://schemas.openxmlformats.org/officeDocument/2006/bibliography" xmlns="http://schemas.openxmlformats.org/officeDocument/2006/bibliography" SelectedStyle="\APASixthEditionOfficeOnline.xsl" StyleName="APA" Version="6"/>
+<?mso-contentType ?>
+<FormTemplates xmlns="http://schemas.microsoft.com/sharepoint/v3/contenttype/forms">
+  <Display>DocumentLibraryForm</Display>
+  <Edit>DocumentLibraryForm</Edit>
+  <New>DocumentLibraryForm</New>
+</FormTemplates>
 </file>
 
 <file path=customXml/item4.xml><?xml version="1.0" encoding="utf-8"?>
@@ -19954,9 +20087,9 @@
 </file>
 
 <file path=customXml/itemProps1.xml><?xml version="1.0" encoding="utf-8"?>
-<ds:datastoreItem xmlns:ds="http://schemas.openxmlformats.org/officeDocument/2006/customXml" ds:itemID="{49A2F7EF-DE38-4CBB-AAB8-D2B9ACC01C07}">
+<ds:datastoreItem xmlns:ds="http://schemas.openxmlformats.org/officeDocument/2006/customXml" ds:itemID="{126AE071-7486-4AA9-BF0D-71355D9D34D7}">
   <ds:schemaRefs>
-    <ds:schemaRef ds:uri="http://schemas.microsoft.com/sharepoint/v3/contenttype/forms"/>
+    <ds:schemaRef ds:uri="http://schemas.openxmlformats.org/officeDocument/2006/bibliography"/>
   </ds:schemaRefs>
 </ds:datastoreItem>
 </file>
@@ -19972,9 +20105,9 @@
 </file>
 
 <file path=customXml/itemProps3.xml><?xml version="1.0" encoding="utf-8"?>
-<ds:datastoreItem xmlns:ds="http://schemas.openxmlformats.org/officeDocument/2006/customXml" ds:itemID="{126AE071-7486-4AA9-BF0D-71355D9D34D7}">
+<ds:datastoreItem xmlns:ds="http://schemas.openxmlformats.org/officeDocument/2006/customXml" ds:itemID="{49A2F7EF-DE38-4CBB-AAB8-D2B9ACC01C07}">
   <ds:schemaRefs>
-    <ds:schemaRef ds:uri="http://schemas.openxmlformats.org/officeDocument/2006/bibliography"/>
+    <ds:schemaRef ds:uri="http://schemas.microsoft.com/sharepoint/v3/contenttype/forms"/>
   </ds:schemaRefs>
 </ds:datastoreItem>
 </file>

</xml_diff>